<commit_message>
Update 3GPP specifications 2026-08-03
</commit_message>
<xml_diff>
--- a/TS 33.250 - PGW/v.19.0.0/33250-v1900.docx
+++ b/TS 33.250 - PGW/v.19.0.0/33250-v1900.docx
@@ -516,7 +516,7 @@
                                 <v:shape id="ole_rId2" type="_x0000_tole_rId2" style="width:95.1pt;height:58.7pt" filled="f" o:ole="">
                                   <v:imagedata r:id="rId3" o:title=""/>
                                 </v:shape>
-                                <o:OLEObject Type="Embed" ProgID="" ShapeID="ole_rId2" DrawAspect="Content" ObjectID="_1979627435" r:id="rId2"/>
+                                <o:OLEObject Type="Embed" ProgID="" ShapeID="ole_rId2" DrawAspect="Content" ObjectID="_115022435" r:id="rId2"/>
                               </w:object>
                             </w:r>
                             <w:r>
@@ -649,7 +649,7 @@
                           <v:shape id="ole_rId5" type="_x0000_tole_rId5" style="width:95.1pt;height:58.7pt" filled="f" o:ole="">
                             <v:imagedata r:id="rId6" o:title=""/>
                           </v:shape>
-                          <o:OLEObject Type="Embed" ProgID="" ShapeID="ole_rId5" DrawAspect="Content" ObjectID="_877200927" r:id="rId5"/>
+                          <o:OLEObject Type="Embed" ProgID="" ShapeID="ole_rId5" DrawAspect="Content" ObjectID="_471924963" r:id="rId5"/>
                         </w:object>
                       </w:r>
                       <w:r>

</xml_diff>

<commit_message>
Update 3GPP specifications 2026-08-17
</commit_message>
<xml_diff>
--- a/TS 33.250 - PGW/v.19.0.0/33250-v1900.docx
+++ b/TS 33.250 - PGW/v.19.0.0/33250-v1900.docx
@@ -516,7 +516,7 @@
                                 <v:shape id="ole_rId2" type="_x0000_tole_rId2" style="width:95.1pt;height:58.7pt" filled="f" o:ole="">
                                   <v:imagedata r:id="rId3" o:title=""/>
                                 </v:shape>
-                                <o:OLEObject Type="Embed" ProgID="" ShapeID="ole_rId2" DrawAspect="Content" ObjectID="_115022435" r:id="rId2"/>
+                                <o:OLEObject Type="Embed" ProgID="" ShapeID="ole_rId2" DrawAspect="Content" ObjectID="_1111658369" r:id="rId2"/>
                               </w:object>
                             </w:r>
                             <w:r>
@@ -649,7 +649,7 @@
                           <v:shape id="ole_rId5" type="_x0000_tole_rId5" style="width:95.1pt;height:58.7pt" filled="f" o:ole="">
                             <v:imagedata r:id="rId6" o:title=""/>
                           </v:shape>
-                          <o:OLEObject Type="Embed" ProgID="" ShapeID="ole_rId5" DrawAspect="Content" ObjectID="_471924963" r:id="rId5"/>
+                          <o:OLEObject Type="Embed" ProgID="" ShapeID="ole_rId5" DrawAspect="Content" ObjectID="_850662455" r:id="rId5"/>
                         </w:object>
                       </w:r>
                       <w:r>

</xml_diff>

<commit_message>
Update 3GPP specifications 2026-08-31
</commit_message>
<xml_diff>
--- a/TS 33.250 - PGW/v.19.0.0/33250-v1900.docx
+++ b/TS 33.250 - PGW/v.19.0.0/33250-v1900.docx
@@ -516,7 +516,7 @@
                                 <v:shape id="ole_rId2" type="_x0000_tole_rId2" style="width:95.1pt;height:58.7pt" filled="f" o:ole="">
                                   <v:imagedata r:id="rId3" o:title=""/>
                                 </v:shape>
-                                <o:OLEObject Type="Embed" ProgID="" ShapeID="ole_rId2" DrawAspect="Content" ObjectID="_1111658369" r:id="rId2"/>
+                                <o:OLEObject Type="Embed" ProgID="" ShapeID="ole_rId2" DrawAspect="Content" ObjectID="_1182482561" r:id="rId2"/>
                               </w:object>
                             </w:r>
                             <w:r>
@@ -649,7 +649,7 @@
                           <v:shape id="ole_rId5" type="_x0000_tole_rId5" style="width:95.1pt;height:58.7pt" filled="f" o:ole="">
                             <v:imagedata r:id="rId6" o:title=""/>
                           </v:shape>
-                          <o:OLEObject Type="Embed" ProgID="" ShapeID="ole_rId5" DrawAspect="Content" ObjectID="_850662455" r:id="rId5"/>
+                          <o:OLEObject Type="Embed" ProgID="" ShapeID="ole_rId5" DrawAspect="Content" ObjectID="_1710377775" r:id="rId5"/>
                         </w:object>
                       </w:r>
                       <w:r>

</xml_diff>

<commit_message>
Update 3GPP specifications 2026-09-14
</commit_message>
<xml_diff>
--- a/TS 33.250 - PGW/v.19.0.0/33250-v1900.docx
+++ b/TS 33.250 - PGW/v.19.0.0/33250-v1900.docx
@@ -516,7 +516,7 @@
                                 <v:shape id="ole_rId2" type="_x0000_tole_rId2" style="width:95.1pt;height:58.7pt" filled="f" o:ole="">
                                   <v:imagedata r:id="rId3" o:title=""/>
                                 </v:shape>
-                                <o:OLEObject Type="Embed" ProgID="" ShapeID="ole_rId2" DrawAspect="Content" ObjectID="_1182482561" r:id="rId2"/>
+                                <o:OLEObject Type="Embed" ProgID="" ShapeID="ole_rId2" DrawAspect="Content" ObjectID="_1719937807" r:id="rId2"/>
                               </w:object>
                             </w:r>
                             <w:r>
@@ -649,7 +649,7 @@
                           <v:shape id="ole_rId5" type="_x0000_tole_rId5" style="width:95.1pt;height:58.7pt" filled="f" o:ole="">
                             <v:imagedata r:id="rId6" o:title=""/>
                           </v:shape>
-                          <o:OLEObject Type="Embed" ProgID="" ShapeID="ole_rId5" DrawAspect="Content" ObjectID="_1710377775" r:id="rId5"/>
+                          <o:OLEObject Type="Embed" ProgID="" ShapeID="ole_rId5" DrawAspect="Content" ObjectID="_310933536" r:id="rId5"/>
                         </w:object>
                       </w:r>
                       <w:r>

</xml_diff>

<commit_message>
Update 3GPP specifications 2026-09-28
</commit_message>
<xml_diff>
--- a/TS 33.250 - PGW/v.19.0.0/33250-v1900.docx
+++ b/TS 33.250 - PGW/v.19.0.0/33250-v1900.docx
@@ -516,7 +516,7 @@
                                 <v:shape id="ole_rId2" type="_x0000_tole_rId2" style="width:95.1pt;height:58.7pt" filled="f" o:ole="">
                                   <v:imagedata r:id="rId3" o:title=""/>
                                 </v:shape>
-                                <o:OLEObject Type="Embed" ProgID="" ShapeID="ole_rId2" DrawAspect="Content" ObjectID="_1719937807" r:id="rId2"/>
+                                <o:OLEObject Type="Embed" ProgID="" ShapeID="ole_rId2" DrawAspect="Content" ObjectID="_1540457094" r:id="rId2"/>
                               </w:object>
                             </w:r>
                             <w:r>
@@ -649,7 +649,7 @@
                           <v:shape id="ole_rId5" type="_x0000_tole_rId5" style="width:95.1pt;height:58.7pt" filled="f" o:ole="">
                             <v:imagedata r:id="rId6" o:title=""/>
                           </v:shape>
-                          <o:OLEObject Type="Embed" ProgID="" ShapeID="ole_rId5" DrawAspect="Content" ObjectID="_310933536" r:id="rId5"/>
+                          <o:OLEObject Type="Embed" ProgID="" ShapeID="ole_rId5" DrawAspect="Content" ObjectID="_1426755670" r:id="rId5"/>
                         </w:object>
                       </w:r>
                       <w:r>

</xml_diff>

<commit_message>
Update 3GPP specifications 2026-10-12
</commit_message>
<xml_diff>
--- a/TS 33.250 - PGW/v.19.0.0/33250-v1900.docx
+++ b/TS 33.250 - PGW/v.19.0.0/33250-v1900.docx
@@ -516,7 +516,7 @@
                                 <v:shape id="ole_rId2" type="_x0000_tole_rId2" style="width:95.1pt;height:58.7pt" filled="f" o:ole="">
                                   <v:imagedata r:id="rId3" o:title=""/>
                                 </v:shape>
-                                <o:OLEObject Type="Embed" ProgID="" ShapeID="ole_rId2" DrawAspect="Content" ObjectID="_1540457094" r:id="rId2"/>
+                                <o:OLEObject Type="Embed" ProgID="" ShapeID="ole_rId2" DrawAspect="Content" ObjectID="_200837610" r:id="rId2"/>
                               </w:object>
                             </w:r>
                             <w:r>
@@ -649,7 +649,7 @@
                           <v:shape id="ole_rId5" type="_x0000_tole_rId5" style="width:95.1pt;height:58.7pt" filled="f" o:ole="">
                             <v:imagedata r:id="rId6" o:title=""/>
                           </v:shape>
-                          <o:OLEObject Type="Embed" ProgID="" ShapeID="ole_rId5" DrawAspect="Content" ObjectID="_1426755670" r:id="rId5"/>
+                          <o:OLEObject Type="Embed" ProgID="" ShapeID="ole_rId5" DrawAspect="Content" ObjectID="_1959369349" r:id="rId5"/>
                         </w:object>
                       </w:r>
                       <w:r>

</xml_diff>

<commit_message>
Update 3GPP specifications 2026-10-13
</commit_message>
<xml_diff>
--- a/TS 33.250 - PGW/v.19.0.0/33250-v1900.docx
+++ b/TS 33.250 - PGW/v.19.0.0/33250-v1900.docx
@@ -516,7 +516,7 @@
                                 <v:shape id="ole_rId2" type="_x0000_tole_rId2" style="width:95.1pt;height:58.7pt" filled="f" o:ole="">
                                   <v:imagedata r:id="rId3" o:title=""/>
                                 </v:shape>
-                                <o:OLEObject Type="Embed" ProgID="" ShapeID="ole_rId2" DrawAspect="Content" ObjectID="_200837610" r:id="rId2"/>
+                                <o:OLEObject Type="Embed" ProgID="" ShapeID="ole_rId2" DrawAspect="Content" ObjectID="_1249011370" r:id="rId2"/>
                               </w:object>
                             </w:r>
                             <w:r>
@@ -649,7 +649,7 @@
                           <v:shape id="ole_rId5" type="_x0000_tole_rId5" style="width:95.1pt;height:58.7pt" filled="f" o:ole="">
                             <v:imagedata r:id="rId6" o:title=""/>
                           </v:shape>
-                          <o:OLEObject Type="Embed" ProgID="" ShapeID="ole_rId5" DrawAspect="Content" ObjectID="_1959369349" r:id="rId5"/>
+                          <o:OLEObject Type="Embed" ProgID="" ShapeID="ole_rId5" DrawAspect="Content" ObjectID="_1398049391" r:id="rId5"/>
                         </w:object>
                       </w:r>
                       <w:r>

</xml_diff>